<commit_message>
Updated release notes with review comments
</commit_message>
<xml_diff>
--- a/doc/release/HPC DME Release Notes 3.29.0.docx
+++ b/doc/release/HPC DME Release Notes 3.29.0.docx
@@ -4379,6 +4379,7 @@
             <w:bookmarkStart w:id="30" w:name="OLE_LINK20"/>
             <w:bookmarkStart w:id="31" w:name="OLE_LINK33"/>
             <w:bookmarkStart w:id="32" w:name="OLE_LINK28"/>
+            <w:bookmarkStart w:id="33" w:name="OLE_LINK30"/>
             <w:r>
               <w:rPr>
                 <w:rFonts w:ascii="Aptos" w:hAnsi="Aptos"/>
@@ -4407,8 +4408,19 @@
                 <w:color w:val="000000" w:themeColor="text1"/>
                 <w:sz w:val="22"/>
                 <w:szCs w:val="22"/>
+                <w:u w:val="single"/>
                 <w:shd w:val="clear" w:color="auto" w:fill="FFFFFF"/>
               </w:rPr>
+              <w:t>, HPCDATAMGM-2217</w:t>
+            </w:r>
+            <w:r>
+              <w:rPr>
+                <w:rFonts w:ascii="Aptos" w:hAnsi="Aptos"/>
+                <w:color w:val="000000" w:themeColor="text1"/>
+                <w:sz w:val="22"/>
+                <w:szCs w:val="22"/>
+                <w:shd w:val="clear" w:color="auto" w:fill="FFFFFF"/>
+              </w:rPr>
               <w:t xml:space="preserve">: </w:t>
             </w:r>
             <w:r>
@@ -4418,7 +4430,7 @@
                 <w:sz w:val="22"/>
                 <w:szCs w:val="22"/>
               </w:rPr>
-              <w:t xml:space="preserve">Upgraded the HTTP client and spring-web libraries in the DME command line utilities </w:t>
+              <w:t xml:space="preserve">Upgraded </w:t>
             </w:r>
             <w:r>
               <w:rPr>
@@ -4426,9 +4438,8 @@
                 <w:color w:val="000000" w:themeColor="text1"/>
                 <w:sz w:val="22"/>
                 <w:szCs w:val="22"/>
-                <w:shd w:val="clear" w:color="auto" w:fill="FFFFFF"/>
-              </w:rPr>
-              <w:t xml:space="preserve">to remediate security vulnerabilities flagged by </w:t>
+              </w:rPr>
+              <w:t>the http</w:t>
             </w:r>
             <w:r>
               <w:rPr>
@@ -4436,9 +4447,8 @@
                 <w:color w:val="000000" w:themeColor="text1"/>
                 <w:sz w:val="22"/>
                 <w:szCs w:val="22"/>
-                <w:shd w:val="clear" w:color="auto" w:fill="FFFFFF"/>
-              </w:rPr>
-              <w:t>GitHub</w:t>
+              </w:rPr>
+              <w:t>client and spring-web libraries in the DME command line utilities</w:t>
             </w:r>
             <w:r>
               <w:rPr>
@@ -4446,9 +4456,17 @@
                 <w:color w:val="000000" w:themeColor="text1"/>
                 <w:sz w:val="22"/>
                 <w:szCs w:val="22"/>
-                <w:shd w:val="clear" w:color="auto" w:fill="FFFFFF"/>
-              </w:rPr>
-              <w:t>.</w:t>
+              </w:rPr>
+              <w:t>,</w:t>
+            </w:r>
+            <w:r>
+              <w:rPr>
+                <w:rFonts w:ascii="Aptos" w:hAnsi="Aptos"/>
+                <w:color w:val="000000" w:themeColor="text1"/>
+                <w:sz w:val="22"/>
+                <w:szCs w:val="22"/>
+              </w:rPr>
+              <w:t xml:space="preserve"> </w:t>
             </w:r>
             <w:bookmarkEnd w:id="1"/>
             <w:bookmarkEnd w:id="8"/>
@@ -4457,7 +4475,28 @@
             <w:bookmarkEnd w:id="29"/>
             <w:bookmarkEnd w:id="30"/>
             <w:bookmarkEnd w:id="31"/>
-          </w:p>
+            <w:r>
+              <w:rPr>
+                <w:rFonts w:ascii="Aptos" w:hAnsi="Aptos"/>
+                <w:color w:val="000000" w:themeColor="text1"/>
+                <w:sz w:val="22"/>
+                <w:szCs w:val="22"/>
+                <w:shd w:val="clear" w:color="auto" w:fill="FFFFFF"/>
+              </w:rPr>
+              <w:t xml:space="preserve">and the IDNA and urllib3 libraries in the DME API server </w:t>
+            </w:r>
+            <w:r>
+              <w:rPr>
+                <w:rFonts w:ascii="Aptos" w:hAnsi="Aptos"/>
+                <w:color w:val="000000" w:themeColor="text1"/>
+                <w:sz w:val="22"/>
+                <w:szCs w:val="22"/>
+                <w:shd w:val="clear" w:color="auto" w:fill="FFFFFF"/>
+              </w:rPr>
+              <w:t>to remediate security vulnerabilities flagged by GitHub.</w:t>
+            </w:r>
+          </w:p>
+          <w:bookmarkEnd w:id="33"/>
           <w:p>
             <w:pPr>
               <w:pStyle w:val="NormalWeb"/>
@@ -4619,10 +4658,10 @@
                 <w:szCs w:val="22"/>
               </w:rPr>
             </w:pPr>
-            <w:bookmarkStart w:id="33" w:name="OLE_LINK2"/>
-            <w:bookmarkStart w:id="34" w:name="OLE_LINK5"/>
-          </w:p>
-          <w:bookmarkEnd w:id="33"/>
+            <w:bookmarkStart w:id="34" w:name="OLE_LINK2"/>
+            <w:bookmarkStart w:id="35" w:name="OLE_LINK5"/>
+          </w:p>
+          <w:bookmarkEnd w:id="34"/>
           <w:p>
             <w:pPr>
               <w:pStyle w:val="ListParagraph"/>
@@ -5042,7 +5081,7 @@
             <w:bookmarkEnd w:id="4"/>
             <w:bookmarkEnd w:id="11"/>
             <w:bookmarkEnd w:id="12"/>
-            <w:bookmarkEnd w:id="34"/>
+            <w:bookmarkEnd w:id="35"/>
           </w:p>
           <w:bookmarkEnd w:id="5"/>
           <w:p>

</xml_diff>